<commit_message>
docs: remove Auto Track figure, renumber remaining figures 1-7
- Removed fig3_autotrack.png from report (user request)
- Renumbered: records=3, subscriptions=4, recurring=5, categories=6, liabilities=7
- Updated all inline figure references in body text accordingly
- Regenerated Ledger_App_Research_Paper.docx (1.96 MB, 7 figures)
</commit_message>
<xml_diff>
--- a/docs/Ledger_App_Research_Paper.docx
+++ b/docs/Ledger_App_Research_Paper.docx
@@ -250,134 +250,81 @@
     <w:p>
       <w:pPr>
         <w:jc w:val="center"/>
+        <w:spacing w:before="240" w:after="100" w:line="240" w:lineRule="auto"/>
+      </w:pPr>
+      <w:r>
+        <w:rPr>
+          <w:b/>
+          <w:sz w:val="21"/>
+          <w:color w:val="000000"/>
+        </w:rPr>
+        <w:t>III. PROBLEM STATEMENT</w:t>
+      </w:r>
+    </w:p>
+    <w:p>
+      <w:pPr>
+        <w:jc w:val="both"/>
+        <w:spacing w:line="240" w:lineRule="auto"/>
+      </w:pPr>
+      <w:r>
+        <w:t xml:space="preserve">Cashless transaction volume in Southeast Asia has surged dramatically, with mobile e-wallets and DuitNow QR payments accounting for over 70% of daily consumer transactions [15]. However, the accompanying accounting ecosystem remains fragmented and inadequate. Users encounter four systemic problems in daily bookkeeping:</w:t>
+      </w:r>
+    </w:p>
+    <w:p>
+      <w:pPr>
+        <w:jc w:val="both"/>
+        <w:spacing w:line="240" w:lineRule="auto"/>
+      </w:pPr>
+      <w:r>
+        <w:t xml:space="preserve">1) Internal Transfer Inflation: Routine liquidity transfers between accounts owned by the same user (e.g., reloading Touch 'n Go eWallet from a Maybank checking account) trigger debit push notifications that naive accounting tools misclassify as consumption expenses, artificially distorting monthly expenditure metrics [10].</w:t>
+      </w:r>
+    </w:p>
+    <w:p>
+      <w:pPr>
+        <w:jc w:val="both"/>
+        <w:spacing w:line="240" w:lineRule="auto"/>
+      </w:pPr>
+      <w:r>
+        <w:t xml:space="preserve">2) Shared Dining &amp; Group Advance Pollution: When an individual settles an RM 300 group dinner bill and subsequently receives RM 200 across multiple friend transfers, naive ledgers log RM 300 in food expense and RM 200 in gross income. This double-counting distorts cash flow tracking and invalidates savings rate analytics.</w:t>
+      </w:r>
+    </w:p>
+    <w:p>
+      <w:pPr>
+        <w:jc w:val="both"/>
+        <w:spacing w:line="240" w:lineRule="auto"/>
+      </w:pPr>
+      <w:r>
+        <w:t xml:space="preserve">3) Fragile Monolithic Parsers: Financial notification parsing routines frequently rely on tangled if/elif condition ladders. As financial institutions iteratively update notification formats or introduce new payment rails, hardcoded routines break unexpectedly and introduce regression failures across existing channels.</w:t>
+      </w:r>
+    </w:p>
+    <w:p>
+      <w:pPr>
+        <w:jc w:val="both"/>
+        <w:spacing w:line="240" w:lineRule="auto"/>
+      </w:pPr>
+      <w:r>
+        <w:t xml:space="preserve">4) Canvas Visualization Clipping in Responsive Dashboards: In internationalized analytics dashboards, text strings inside doughnut charts (e.g., 'Total Cumulative Expenses' vs. 'Jumlah Perbelanjaan Terkumpul') possess unequal widths. Fixed font sizes cause rendered text to exceed doughnut cutouts, resulting in chart segments physically occluding numerical values.</w:t>
+      </w:r>
+    </w:p>
+    <w:p>
+      <w:pPr>
+        <w:jc w:val="center"/>
         <w:spacing w:before="140" w:after="60"/>
       </w:pPr>
       <w:r>
         <w:drawing>
           <wp:inline distT="0" distB="0" distL="0" distR="0">
-            <wp:extent cx="2743200" cy="2900000"/>
+            <wp:extent cx="2743200" cy="1992630"/>
             <wp:docPr id="3" name="Figure 3"/>
             <a:graphic xmlns:a="http://schemas.openxmlformats.org/drawingml/2006/main">
               <a:graphicData uri="http://schemas.openxmlformats.org/drawingml/2006/picture">
                 <pic:pic xmlns:pic="http://schemas.openxmlformats.org/drawingml/2006/picture">
                   <pic:nvPicPr>
-                    <pic:cNvPr id="3" name="fig3_autotrack.png"/>
+                    <pic:cNvPr id="3" name="fig3_records.png"/>
                     <pic:cNvPicPr/>
                   </pic:nvPicPr>
                   <pic:blipFill>
                     <a:blip xmlns:r="http://schemas.openxmlformats.org/officeDocument/2006/relationships" r:embed="rIdImg3"/>
-                    <a:stretch>
-                      <a:fillRect/>
-                    </a:stretch>
-                  </pic:blipFill>
-                  <pic:spPr>
-                    <a:xfrm>
-                      <a:off x="0" y="0"/>
-                      <a:ext cx="2743200" cy="2900000"/>
-                    </a:xfrm>
-                    <a:prstGeom prst="rect">
-                      <a:avLst/>
-                    </a:prstGeom>
-                  </pic:spPr>
-                </pic:pic>
-              </a:graphicData>
-            </a:graphic>
-          </wp:inline>
-        </w:drawing>
-      </w:r>
-    </w:p>
-    <w:p>
-      <w:pPr>
-        <w:jc w:val="center"/>
-        <w:spacing w:before="40" w:after="160"/>
-        <w:line w:line="220" w:lineRule="auto"/>
-      </w:pPr>
-      <w:r>
-        <w:rPr>
-          <w:sz w:val="17"/>
-          <w:color w:val="1E293B"/>
-        </w:rPr>
-        <w:t xml:space="preserve">Figure 3. Auto Track self-hosted webhook gateway: unified header endpoint, MacroDroid integration guide, live notification simulation panel, and AI few-shot training datasheet for transaction classification.</w:t>
-      </w:r>
-    </w:p>
-    <w:p>
-      <w:pPr>
-        <w:jc w:val="center"/>
-        <w:spacing w:before="240" w:after="100" w:line="240" w:lineRule="auto"/>
-      </w:pPr>
-      <w:r>
-        <w:rPr>
-          <w:b/>
-          <w:sz w:val="21"/>
-          <w:color w:val="000000"/>
-        </w:rPr>
-        <w:t>III. PROBLEM STATEMENT</w:t>
-      </w:r>
-    </w:p>
-    <w:p>
-      <w:pPr>
-        <w:jc w:val="both"/>
-        <w:spacing w:line="240" w:lineRule="auto"/>
-      </w:pPr>
-      <w:r>
-        <w:t xml:space="preserve">Cashless transaction volume in Southeast Asia has surged dramatically, with mobile e-wallets and DuitNow QR payments accounting for over 70% of daily consumer transactions [15]. However, the accompanying accounting ecosystem remains fragmented and inadequate. Users encounter four systemic problems in daily bookkeeping:</w:t>
-      </w:r>
-    </w:p>
-    <w:p>
-      <w:pPr>
-        <w:jc w:val="both"/>
-        <w:spacing w:line="240" w:lineRule="auto"/>
-      </w:pPr>
-      <w:r>
-        <w:t xml:space="preserve">1) Internal Transfer Inflation: Routine liquidity transfers between accounts owned by the same user (e.g., reloading Touch 'n Go eWallet from a Maybank checking account) trigger debit push notifications that naive accounting tools misclassify as consumption expenses, artificially distorting monthly expenditure metrics [10].</w:t>
-      </w:r>
-    </w:p>
-    <w:p>
-      <w:pPr>
-        <w:jc w:val="both"/>
-        <w:spacing w:line="240" w:lineRule="auto"/>
-      </w:pPr>
-      <w:r>
-        <w:t xml:space="preserve">2) Shared Dining &amp; Group Advance Pollution: When an individual settles an RM 300 group dinner bill and subsequently receives RM 200 across multiple friend transfers, naive ledgers log RM 300 in food expense and RM 200 in gross income. This double-counting distorts cash flow tracking and invalidates savings rate analytics.</w:t>
-      </w:r>
-    </w:p>
-    <w:p>
-      <w:pPr>
-        <w:jc w:val="both"/>
-        <w:spacing w:line="240" w:lineRule="auto"/>
-      </w:pPr>
-      <w:r>
-        <w:t xml:space="preserve">3) Fragile Monolithic Parsers: Financial notification parsing routines frequently rely on tangled if/elif condition ladders. As financial institutions iteratively update notification formats or introduce new payment rails, hardcoded routines break unexpectedly and introduce regression failures across existing channels.</w:t>
-      </w:r>
-    </w:p>
-    <w:p>
-      <w:pPr>
-        <w:jc w:val="both"/>
-        <w:spacing w:line="240" w:lineRule="auto"/>
-      </w:pPr>
-      <w:r>
-        <w:t xml:space="preserve">4) Canvas Visualization Clipping in Responsive Dashboards: In internationalized analytics dashboards, text strings inside doughnut charts (e.g., 'Total Cumulative Expenses' vs. 'Jumlah Perbelanjaan Terkumpul') possess unequal widths. Fixed font sizes cause rendered text to exceed doughnut cutouts, resulting in chart segments physically occluding numerical values.</w:t>
-      </w:r>
-    </w:p>
-    <w:p>
-      <w:pPr>
-        <w:jc w:val="center"/>
-        <w:spacing w:before="140" w:after="60"/>
-      </w:pPr>
-      <w:r>
-        <w:drawing>
-          <wp:inline distT="0" distB="0" distL="0" distR="0">
-            <wp:extent cx="2743200" cy="1992630"/>
-            <wp:docPr id="4" name="Figure 4"/>
-            <a:graphic xmlns:a="http://schemas.openxmlformats.org/drawingml/2006/main">
-              <a:graphicData uri="http://schemas.openxmlformats.org/drawingml/2006/picture">
-                <pic:pic xmlns:pic="http://schemas.openxmlformats.org/drawingml/2006/picture">
-                  <pic:nvPicPr>
-                    <pic:cNvPr id="4" name="fig4_records.png"/>
-                    <pic:cNvPicPr/>
-                  </pic:nvPicPr>
-                  <pic:blipFill>
-                    <a:blip xmlns:r="http://schemas.openxmlformats.org/officeDocument/2006/relationships" r:embed="rIdImg4"/>
                     <a:stretch>
                       <a:fillRect/>
                     </a:stretch>
@@ -409,7 +356,7 @@
           <w:sz w:val="17"/>
           <w:color w:val="1E293B"/>
         </w:rPr>
-        <w:t xml:space="preserve">Figure 4. Transaction History audit table: multi-criteria date/category filters, batch selection, delete controls, and expense-offset status indicators for friend reimbursements.</w:t>
+        <w:t xml:space="preserve">Figure 3. Transaction History audit table: multi-criteria date/category filters, batch selection, delete controls, and expense-offset status indicators for friend reimbursements.</w:t>
       </w:r>
     </w:p>
     <w:p>
@@ -860,7 +807,7 @@
         <w:spacing w:line="240" w:lineRule="auto"/>
       </w:pPr>
       <w:r>
-        <w:t xml:space="preserve">To achieve true Open/Closed extensibility (GoF Strategy Pattern [10]), all payment notification parsers derive from NotificationParserStrategy, defining strict can_parse(pkg, title, text) -&gt; bool and parse(...) contracts. Concrete strategies are dynamically discovered and instantiated at runtime via the @register_parser decorator, as shown in Figure 4. Independent strategies are deployed for Touch 'n Go, GrabPay, Maybank MAE, and universal bank card SMS templates [15], [16].</w:t>
+        <w:t xml:space="preserve">To achieve true Open/Closed extensibility (GoF Strategy Pattern [10]), all payment notification parsers derive from NotificationParserStrategy, defining strict can_parse(pkg, title, text) -&gt; bool and parse(...) contracts. Concrete strategies are dynamically discovered and instantiated at runtime via the @register_parser decorator. Independent strategies are deployed for Touch 'n Go, GrabPay, Maybank MAE, and universal bank card SMS templates [15], [16].</w:t>
       </w:r>
     </w:p>
     <w:p>
@@ -872,16 +819,16 @@
         <w:drawing>
           <wp:inline distT="0" distB="0" distL="0" distR="0">
             <wp:extent cx="2743200" cy="1790700"/>
-            <wp:docPr id="5" name="Figure 5"/>
+            <wp:docPr id="4" name="Figure 4"/>
             <a:graphic xmlns:a="http://schemas.openxmlformats.org/drawingml/2006/main">
               <a:graphicData uri="http://schemas.openxmlformats.org/drawingml/2006/picture">
                 <pic:pic xmlns:pic="http://schemas.openxmlformats.org/drawingml/2006/picture">
                   <pic:nvPicPr>
-                    <pic:cNvPr id="5" name="fig5_subscriptions.png"/>
+                    <pic:cNvPr id="4" name="fig4_subscriptions.png"/>
                     <pic:cNvPicPr/>
                   </pic:nvPicPr>
                   <pic:blipFill>
-                    <a:blip xmlns:r="http://schemas.openxmlformats.org/officeDocument/2006/relationships" r:embed="rIdImg5"/>
+                    <a:blip xmlns:r="http://schemas.openxmlformats.org/officeDocument/2006/relationships" r:embed="rIdImg4"/>
                     <a:stretch>
                       <a:fillRect/>
                     </a:stretch>
@@ -913,7 +860,7 @@
           <w:sz w:val="17"/>
           <w:color w:val="1E293B"/>
         </w:rPr>
-        <w:t xml:space="preserve">Figure 5. Subscriptions tracker: active subscription cards with renewal dates, monthly cost aggregation, and next-charge countdown badges.</w:t>
+        <w:t xml:space="preserve">Figure 4. Subscriptions tracker: active subscription cards with renewal dates, monthly cost aggregation, and next-charge countdown badges.</w:t>
       </w:r>
     </w:p>
     <w:p>
@@ -949,16 +896,16 @@
         <w:drawing>
           <wp:inline distT="0" distB="0" distL="0" distR="0">
             <wp:extent cx="2743200" cy="2253615"/>
-            <wp:docPr id="6" name="Figure 6"/>
+            <wp:docPr id="5" name="Figure 5"/>
             <a:graphic xmlns:a="http://schemas.openxmlformats.org/drawingml/2006/main">
               <a:graphicData uri="http://schemas.openxmlformats.org/drawingml/2006/picture">
                 <pic:pic xmlns:pic="http://schemas.openxmlformats.org/drawingml/2006/picture">
                   <pic:nvPicPr>
-                    <pic:cNvPr id="6" name="fig6_recurring.png"/>
+                    <pic:cNvPr id="5" name="fig5_recurring.png"/>
                     <pic:cNvPicPr/>
                   </pic:nvPicPr>
                   <pic:blipFill>
-                    <a:blip xmlns:r="http://schemas.openxmlformats.org/officeDocument/2006/relationships" r:embed="rIdImg6"/>
+                    <a:blip xmlns:r="http://schemas.openxmlformats.org/officeDocument/2006/relationships" r:embed="rIdImg5"/>
                     <a:stretch>
                       <a:fillRect/>
                     </a:stretch>
@@ -990,7 +937,7 @@
           <w:sz w:val="17"/>
           <w:color w:val="1E293B"/>
         </w:rPr>
-        <w:t xml:space="preserve">Figure 6. Fixed/Recurring Income &amp; Expense Rules manager: rule table with type badges (income/expense/saving), category, billing day, status toggle, and add-rule form.</w:t>
+        <w:t xml:space="preserve">Figure 5. Fixed/Recurring Income &amp; Expense Rules manager: rule table with type badges (income/expense/saving), category, billing day, status toggle, and add-rule form.</w:t>
       </w:r>
     </w:p>
     <w:p>
@@ -1026,16 +973,16 @@
         <w:drawing>
           <wp:inline distT="0" distB="0" distL="0" distR="0">
             <wp:extent cx="2743200" cy="2333625"/>
-            <wp:docPr id="7" name="Figure 7"/>
+            <wp:docPr id="6" name="Figure 6"/>
             <a:graphic xmlns:a="http://schemas.openxmlformats.org/drawingml/2006/main">
               <a:graphicData uri="http://schemas.openxmlformats.org/drawingml/2006/picture">
                 <pic:pic xmlns:pic="http://schemas.openxmlformats.org/drawingml/2006/picture">
                   <pic:nvPicPr>
-                    <pic:cNvPr id="7" name="fig7_categories_budget.png"/>
+                    <pic:cNvPr id="6" name="fig6_categories_budget.png"/>
                     <pic:cNvPicPr/>
                   </pic:nvPicPr>
                   <pic:blipFill>
-                    <a:blip xmlns:r="http://schemas.openxmlformats.org/officeDocument/2006/relationships" r:embed="rIdImg7"/>
+                    <a:blip xmlns:r="http://schemas.openxmlformats.org/officeDocument/2006/relationships" r:embed="rIdImg6"/>
                     <a:stretch>
                       <a:fillRect/>
                     </a:stretch>
@@ -1067,7 +1014,7 @@
           <w:sz w:val="17"/>
           <w:color w:val="1E293B"/>
         </w:rPr>
-        <w:t xml:space="preserve">Figure 7. Category &amp; Tag Management with Monthly Budget: expense categories with real-time RM budget usage percentages and saving pool classifications.</w:t>
+        <w:t xml:space="preserve">Figure 6. Category &amp; Tag Management with Monthly Budget: expense categories with real-time RM budget usage percentages and saving pool classifications.</w:t>
       </w:r>
     </w:p>
     <w:p>
@@ -1126,16 +1073,16 @@
         <w:drawing>
           <wp:inline distT="0" distB="0" distL="0" distR="0">
             <wp:extent cx="2743200" cy="2230755"/>
-            <wp:docPr id="8" name="Figure 8"/>
+            <wp:docPr id="7" name="Figure 7"/>
             <a:graphic xmlns:a="http://schemas.openxmlformats.org/drawingml/2006/main">
               <a:graphicData uri="http://schemas.openxmlformats.org/drawingml/2006/picture">
                 <pic:pic xmlns:pic="http://schemas.openxmlformats.org/drawingml/2006/picture">
                   <pic:nvPicPr>
-                    <pic:cNvPr id="8" name="fig8_liabilities.png"/>
+                    <pic:cNvPr id="7" name="fig7_liabilities.png"/>
                     <pic:cNvPicPr/>
                   </pic:nvPicPr>
                   <pic:blipFill>
-                    <a:blip xmlns:r="http://schemas.openxmlformats.org/officeDocument/2006/relationships" r:embed="rIdImg8"/>
+                    <a:blip xmlns:r="http://schemas.openxmlformats.org/officeDocument/2006/relationships" r:embed="rIdImg7"/>
                     <a:stretch>
                       <a:fillRect/>
                     </a:stretch>
@@ -1167,7 +1114,7 @@
           <w:sz w:val="17"/>
           <w:color w:val="1E293B"/>
         </w:rPr>
-        <w:t xml:space="preserve">Figure 8. Liabilities &amp; 0% EPP Tracker: monthly cash-flow schedule, 0% installment plan (EPP) progress tracker, and fixed loan amortization monitor.</w:t>
+        <w:t xml:space="preserve">Figure 7. Liabilities &amp; 0% EPP Tracker: monthly cash-flow schedule, 0% installment plan (EPP) progress tracker, and fixed loan amortization monitor.</w:t>
       </w:r>
     </w:p>
     <w:p>
@@ -1191,7 +1138,7 @@
         <w:spacing w:line="240" w:lineRule="auto"/>
       </w:pPr>
       <w:r>
-        <w:t xml:space="preserve">Empirical benchmarks were conducted over 50 real-world dining receipts under diverse lighting, folds, and camera tilts. Running on a standard quad-core Intel i5 CPU without GPU acceleration, RapidOCR achieved an average inference latency of 342 ms. The 4-way orientation detection pipeline correctly aligned 98.0% of skewed captures. Line-item extraction achieved 94.2% precision, successfully parsing item names, unit costs, and separate tax columns into an interactive split matrix (Figure 3).</w:t>
+        <w:t xml:space="preserve">Empirical benchmarks were conducted over 50 real-world dining receipts under diverse lighting, folds, and camera tilts. Running on a standard quad-core Intel i5 CPU without GPU acceleration, RapidOCR achieved an average inference latency of 342 ms. The 4-way orientation detection pipeline correctly aligned 98.0% of skewed captures. Line-item extraction achieved 94.2% precision, successfully parsing item names, unit costs, and separate tax columns into an interactive split matrix (Figure 2).</w:t>
       </w:r>
     </w:p>
     <w:p>

</xml_diff>